<commit_message>
Add Takaya's phone number so USAA can contact her directly
+81-80-4621-5400 inserted in two places:

1. Letterhead block, beneath the FPO address: "Telephone: +81-80-4621-5400".
2. Closing paragraph, before the 15-business-days sentence:
   "I may be reached by telephone at +81-80-4621-5400."

The original letter left the reader to infer a contact channel from the
FPO address alone; given that the entire submission is about USAA's
repeated failure to reach Takaya, making the working phone number
unambiguously visible is essential.

Section 8 checklist re-verified: pass.
</commit_message>
<xml_diff>
--- a/output/cover-letter.docx
+++ b/output/cover-letter.docx
@@ -42,6 +42,18 @@
           <w:sz w:val="22"/>
         </w:rPr>
         <w:t>FPO AP 96379-0010</w:t>
+      </w:r>
+    </w:p>
+    <w:p>
+      <w:pPr>
+        <w:spacing w:line="276" w:lineRule="auto" w:after="120"/>
+      </w:pPr>
+      <w:r>
+        <w:rPr>
+          <w:rFonts w:ascii="Times New Roman" w:hAnsi="Times New Roman"/>
+          <w:sz w:val="22"/>
+        </w:rPr>
+        <w:t>Telephone: +81-80-4621-5400</w:t>
       </w:r>
     </w:p>
     <w:p>
@@ -392,12 +404,10 @@
       </w:pPr>
       <w:r>
         <w:rPr>
-          <w:rFonts w:ascii="Times New Roman" w:hAnsi="Times New Roman" w:eastAsia="Times New Roman"/>
-          <w:b w:val="0"/>
-          <w:i w:val="0"/>
+          <w:rFonts w:ascii="Times New Roman" w:hAnsi="Times New Roman"/>
           <w:sz w:val="22"/>
         </w:rPr>
-        <w:t>I expect a written response within 15 business days of USAA's receipt of this package. A full record of this matter, including every letter, portal message, and telephone call described above, has been preserved.</w:t>
+        <w:t>I may be reached by telephone at +81-80-4621-5400. I expect a written response within 15 business days of USAA's receipt of this package. A full record of this matter, including every letter, portal message, and telephone call described above, has been preserved.</w:t>
       </w:r>
     </w:p>
     <w:p>

</xml_diff>